<commit_message>
did changes in doc
</commit_message>
<xml_diff>
--- a/Assignment_1_Linux_Basics.docx
+++ b/Assignment_1_Linux_Basics.docx
@@ -58,6 +58,16 @@
         <w:spacing w:after="0" w:line="240" w:lineRule="auto"/>
         <w:ind w:firstLine="720"/>
       </w:pPr>
+      <w:r>
+        <w:rPr>
+          <w:b/>
+          <w:bCs/>
+        </w:rPr>
+        <w:t>Explanation:</w:t>
+      </w:r>
+      <w:r>
+        <w:t xml:space="preserve"> </w:t>
+      </w:r>
       <w:proofErr w:type="spellStart"/>
       <w:r>
         <w:t>mkdir</w:t>
@@ -120,6 +130,16 @@
         <w:spacing w:after="0" w:line="240" w:lineRule="auto"/>
       </w:pPr>
       <w:r>
+        <w:rPr>
+          <w:b/>
+          <w:bCs/>
+        </w:rPr>
+        <w:t>Explanation:</w:t>
+      </w:r>
+      <w:r>
+        <w:t xml:space="preserve"> </w:t>
+      </w:r>
+      <w:r>
         <w:t>cd means change directory.</w:t>
       </w:r>
       <w:r>
@@ -154,6 +174,16 @@
         <w:pStyle w:val="ListParagraph"/>
         <w:spacing w:after="0" w:line="240" w:lineRule="auto"/>
       </w:pPr>
+      <w:r>
+        <w:rPr>
+          <w:b/>
+          <w:bCs/>
+        </w:rPr>
+        <w:t>Explanation:</w:t>
+      </w:r>
+      <w:r>
+        <w:t xml:space="preserve"> </w:t>
+      </w:r>
       <w:r>
         <w:t>touch creates an empty file if the file does not already exist.</w:t>
       </w:r>
@@ -205,6 +235,16 @@
         <w:ind w:left="720"/>
       </w:pPr>
       <w:r>
+        <w:rPr>
+          <w:b/>
+          <w:bCs/>
+        </w:rPr>
+        <w:t>Explanation:</w:t>
+      </w:r>
+      <w:r>
+        <w:t xml:space="preserve"> </w:t>
+      </w:r>
+      <w:r>
         <w:t>mv means move.</w:t>
       </w:r>
       <w:r>
@@ -277,6 +317,16 @@
         <w:ind w:left="720"/>
       </w:pPr>
       <w:r>
+        <w:rPr>
+          <w:b/>
+          <w:bCs/>
+        </w:rPr>
+        <w:t>Explanation:</w:t>
+      </w:r>
+      <w:r>
+        <w:t xml:space="preserve"> </w:t>
+      </w:r>
+      <w:r>
         <w:t>cat displays the contents of a file.</w:t>
       </w:r>
       <w:r>
@@ -333,6 +383,16 @@
         <w:t xml:space="preserve">               </w:t>
       </w:r>
       <w:r>
+        <w:rPr>
+          <w:b/>
+          <w:bCs/>
+        </w:rPr>
+        <w:t>Explanation:</w:t>
+      </w:r>
+      <w:r>
+        <w:t xml:space="preserve"> </w:t>
+      </w:r>
+      <w:r>
         <w:t>head displays the beginning of a file.</w:t>
       </w:r>
       <w:r>
@@ -382,6 +442,16 @@
         <w:pStyle w:val="ListParagraph"/>
         <w:spacing w:after="0" w:line="240" w:lineRule="auto"/>
       </w:pPr>
+      <w:r>
+        <w:rPr>
+          <w:b/>
+          <w:bCs/>
+        </w:rPr>
+        <w:t>Explanation:</w:t>
+      </w:r>
+      <w:r>
+        <w:t xml:space="preserve"> </w:t>
+      </w:r>
       <w:r>
         <w:t>tail displays the end of a file.</w:t>
       </w:r>
@@ -457,6 +527,16 @@
         <w:spacing w:after="0" w:line="240" w:lineRule="auto"/>
       </w:pPr>
       <w:r>
+        <w:rPr>
+          <w:b/>
+          <w:bCs/>
+        </w:rPr>
+        <w:t>Explanation:</w:t>
+      </w:r>
+      <w:r>
+        <w:t xml:space="preserve"> </w:t>
+      </w:r>
+      <w:r>
         <w:t>grep searches for matching text</w:t>
       </w:r>
       <w:r>
@@ -535,6 +615,16 @@
         <w:spacing w:after="0" w:line="240" w:lineRule="auto"/>
       </w:pPr>
       <w:r>
+        <w:rPr>
+          <w:b/>
+          <w:bCs/>
+        </w:rPr>
+        <w:t>Explanation:</w:t>
+      </w:r>
+      <w:r>
+        <w:t xml:space="preserve"> </w:t>
+      </w:r>
+      <w:r>
         <w:t>zip creates a ZIP archive</w:t>
       </w:r>
       <w:r>
@@ -597,6 +687,16 @@
         <w:spacing w:after="0" w:line="240" w:lineRule="auto"/>
       </w:pPr>
       <w:r>
+        <w:rPr>
+          <w:b/>
+          <w:bCs/>
+        </w:rPr>
+        <w:t>Explanation:</w:t>
+      </w:r>
+      <w:r>
+        <w:t xml:space="preserve"> </w:t>
+      </w:r>
+      <w:r>
         <w:t xml:space="preserve">unzip will unzip the zip file and </w:t>
       </w:r>
       <w:r>
@@ -643,6 +743,7 @@
           <w:b/>
           <w:bCs/>
         </w:rPr>
+        <w:lastRenderedPageBreak/>
         <w:t xml:space="preserve">Use </w:t>
       </w:r>
       <w:proofErr w:type="spellStart"/>
@@ -691,6 +792,16 @@
         <w:spacing w:after="0" w:line="240" w:lineRule="auto"/>
       </w:pPr>
       <w:r>
+        <w:rPr>
+          <w:b/>
+          <w:bCs/>
+        </w:rPr>
+        <w:t>Explanation:</w:t>
+      </w:r>
+      <w:r>
+        <w:t xml:space="preserve"> </w:t>
+      </w:r>
+      <w:r>
         <w:t>This downloads the file into your current directory</w:t>
       </w:r>
       <w:r>
@@ -716,7 +827,6 @@
           <w:b/>
           <w:bCs/>
         </w:rPr>
-        <w:lastRenderedPageBreak/>
         <w:t>6. Changing Permissions</w:t>
       </w:r>
     </w:p>
@@ -786,15 +896,17 @@
         <w:spacing w:after="0" w:line="240" w:lineRule="auto"/>
       </w:pPr>
       <w:r>
-        <w:t xml:space="preserve">The owner and everyone else can read the file, but nobody has </w:t>
-      </w:r>
-      <w:proofErr w:type="gramStart"/>
-      <w:r>
-        <w:t>write</w:t>
-      </w:r>
-      <w:proofErr w:type="gramEnd"/>
-      <w:r>
-        <w:t xml:space="preserve"> or execute permission through </w:t>
+        <w:rPr>
+          <w:b/>
+          <w:bCs/>
+        </w:rPr>
+        <w:t>Explanation:</w:t>
+      </w:r>
+      <w:r>
+        <w:t xml:space="preserve"> </w:t>
+      </w:r>
+      <w:r>
+        <w:t xml:space="preserve">The owner and everyone else can read the file, but nobody has write or execute permission through </w:t>
       </w:r>
       <w:r>
         <w:t>this file permission</w:t>
@@ -861,6 +973,16 @@
         <w:spacing w:after="0" w:line="240" w:lineRule="auto"/>
       </w:pPr>
       <w:r>
+        <w:rPr>
+          <w:b/>
+          <w:bCs/>
+        </w:rPr>
+        <w:t>Explanation:</w:t>
+      </w:r>
+      <w:r>
+        <w:t xml:space="preserve"> </w:t>
+      </w:r>
+      <w:r>
         <w:t>export makes the</w:t>
       </w:r>
       <w:r>
@@ -878,6 +1000,30 @@
           <w:bCs/>
         </w:rPr>
       </w:pPr>
+    </w:p>
+    <w:p>
+      <w:pPr>
+        <w:spacing w:after="0" w:line="240" w:lineRule="auto"/>
+      </w:pPr>
+      <w:proofErr w:type="spellStart"/>
+      <w:r>
+        <w:rPr>
+          <w:b/>
+          <w:bCs/>
+        </w:rPr>
+        <w:t>Git</w:t>
+      </w:r>
+      <w:proofErr w:type="spellEnd"/>
+      <w:r>
+        <w:rPr>
+          <w:b/>
+          <w:bCs/>
+        </w:rPr>
+        <w:t xml:space="preserve"> Repo Link: </w:t>
+      </w:r>
+      <w:r>
+        <w:t>https://github.com/Noor-git-01/Tutedude_DevOps_Repo.git</w:t>
+      </w:r>
     </w:p>
     <w:p>
       <w:pPr>

</xml_diff>